<commit_message>
Style edit of introduction, literature review, theory, and discussion for clarity (numbers and claims unchanged; AI-use statement retained)
Co-Authored-By: Claude Sonnet 5.5 <noreply@anthropic.com>
Claude-Session: https://claude.ai/code/session_01H4JvRLBkzRHsy6jU5TcEWv
</commit_message>
<xml_diff>
--- a/isr_paper/ISR_Submission_Early_Adoption_Delayed_Displacement.docx
+++ b/isr_paper/ISR_Submission_Early_Adoption_Delayed_Displacement.docx
@@ -125,7 +125,7 @@
           <w:sz w:val="24"/>
           <w:szCs w:val="24"/>
         </w:rPr>
-        <w:t xml:space="preserve">Generative AI systems that create images from text prompts, released from 2022, and systems that create video, released from 2024, make a first draft of visual content almost costless. A natural expectation is that they will displace the people who produce such content. Yet general-purpose technologies have often shown a long gap between invention, adoption, and measurable labor-market effects: electric motors changed factory output decades after their introduction, and computers took years to show up in productivity (David 1990; Brynjolfsson et al. 2021). In information systems research, the same idea appears as the gap between a firm’s adoption of an innovation and its deeper assimilation into work (Fichman and Kemerer 1999). Is generative visual AI displacing creative work today, or are we in an early-adoption phase in which displacement is still to come? Studies of online freelance platforms already report declines in demand for image creation (Demirci et al. 2025; Hui et al. 2024), but platforms are a setting in which buyers can switch tools at low cost.</w:t>
+        <w:t xml:space="preserve">Generative AI that creates images from text prompts (available since 2022) and video (since 2024) makes a first draft of visual content almost free. The obvious expectation is that it will displace the people who produce such content. General-purpose technologies, however, have often taken a long time to reach the labor market: electric motors changed factory output decades after they appeared, and computers took years to show up in productivity statistics (David 1990; Brynjolfsson et al. 2021). Information systems research describes a related gap between a firm’s adoption of an innovation and its assimilation into everyday work (Fichman and Kemerer 1999). So is generative visual AI displacing creative work now, or are we still in an early phase of adoption? Studies of online freelance platforms already find lower demand for image creation (Demirci et al. 2025; Hui et al. 2024), but platforms are a setting where buyers can switch tools at little cost.</w:t>
       </w:r>
     </w:p>
     <w:p>
@@ -140,7 +140,7 @@
           <w:sz w:val="24"/>
           <w:szCs w:val="24"/>
         </w:rPr>
-        <w:t xml:space="preserve">We study this question with open data and a model that separates adoption from displacement. The model treats the change in labor demand in an occupation as the product of two terms: the share of employers who have adopted the technology, and the net effect of adoption on hiring among those adopters, which combines substitution and a scale effect from cheaper content. Adoption of a visual generator for a task requires that its output meet the task’s quality requirement at a review cost below the cost of human production, and it is limited by frictions in expertise, legal clarity, and data protection. A small observed effect on labor demand is therefore consistent with several different states of the world: low adoption, low substitution among adopters, offsetting scale effects, or no effect at all. We use data to tell some of these apart.</w:t>
+        <w:t xml:space="preserve">We address this question with open data and a model that separates adoption from displacement. In the model, the change in labor demand in an occupation is the product of two terms: the share of employers that have adopted the technology, and the net effect of adoption on hiring among those adopters, which combines substitution with a scale effect from cheaper content. A firm adopts a visual generator for a task only if its output meets the task’s quality requirement at a review cost below the cost of human production, and adoption is held back by frictions in expertise, legal clarity, and data protection. A small effect on labor demand can therefore mean low adoption, weak substitution among adopters, offsetting scale effects, or no effect at all. We use the data to narrow down which of these is more likely.</w:t>
       </w:r>
     </w:p>
     <w:p>
@@ -155,7 +155,7 @@
           <w:sz w:val="24"/>
           <w:szCs w:val="24"/>
         </w:rPr>
-        <w:t xml:space="preserve">We bring together three sources. First, Eurostat’s enterprise survey on AI, which in 2025 asks whether firms use AI that generates pictures, videos, or audio, and why firms that considered AI did not adopt it. Second, UK online job adverts by occupation from the Office for National Statistics (ONS), covering 413 four-digit occupations from 2017 to 2026. Third, an LLM-coded measure of occupational exposure to visual content creation built from O*NET task statements, which we map to UK occupations through the ISCO-08 classification. As a replication we use Eurostat’s experimental statistics on online job advertisements by ISCO three-digit occupation for 16 European countries from 2019 to 2024, and Statistics Canada’s Job Vacancy and Wage Survey by occupation for 2015 to 2026. We also report, as supplementary evidence, US postings by sector and European employment by industry.</w:t>
+        <w:t xml:space="preserve">We combine three sources. The first is Eurostat’s enterprise survey on AI, which in 2025 asks whether firms use AI that generates pictures, video, or audio, and why firms that considered AI did not adopt it. The second is UK online job adverts by occupation from the Office for National Statistics (ONS), covering 413 four-digit occupations from 2017 to 2026. The third is an LLM-coded measure of occupational exposure to visual content creation, built from O*NET task statements and mapped to UK occupations through ISCO-08. For replication we use Eurostat’s experimental statistics on online job advertisements by three-digit ISCO occupation for 16 European countries from 2019 to 2024, and Statistics Canada’s Job Vacancy and Wage Survey for 2015 to 2026. US postings by sector and European employment by industry serve as supplementary evidence.</w:t>
       </w:r>
     </w:p>
     <w:p>
@@ -170,7 +170,7 @@
           <w:sz w:val="24"/>
           <w:szCs w:val="24"/>
         </w:rPr>
-        <w:t xml:space="preserve">Our findings are as follows. Adoption is already substantial: 9.6% of European firms with ten or more employees use AI that generates pictures, video, or audio, rising to 27.9% among firms with 250 or more employees and to about 36% in publishing, film, and broadcasting. Among firms that considered AI but did not adopt it, 70% cite lack of expertise, 54% unclear legal consequences, and 53% data protection and privacy concerns, against 18% who consider AI not useful. In UK adverts, occupations with higher exposure to visual content creation show small declines after 2022 (about 2 to 3% per standard deviation of exposure by 2025 and 2026, with randomization p-values from 0.03 to 0.47 across years and specifications), but these declines resemble a reversal of a COVID-era pattern, are not concentrated in tasks with low quality requirements, vanish when one occupation is dropped, and are far too large, for the occupations with the highest exposure, to be explained by the observed adoption levels. In the European replication the pattern has the same sign and similar size, with flat pre-period coefficients and two post-2022 years (about −1.6% per standard deviation in 2023 and −1.2% in 2024 with the language control; −3.7% and −5.9% without). In Canada the coefficient is negative in the first post-2022 year (−2.2% per standard deviation, with occupation-group fixed effects) but not afterward. We also use the model to ask when displacement would become detectable: if demand among adopters fell by about 40% and adoption followed the recent path of text-generation AI, the effect would reach the detection threshold of our design around 2029 to 2030, and much later or never for smaller effects. We read the evidence as consistent with early adoption and little detectable displacement so far, and we do not claim that displacement is absent or will not come.</w:t>
+        <w:t xml:space="preserve">Adoption is already substantial. 9.6% of European firms with ten or more employees use AI that generates pictures, video, or audio; the share is 27.9% among firms with 250 or more employees and about 36% in publishing, film, and broadcasting. Among firms that considered AI but did not adopt it, 70% cite lack of expertise, 54% unclear legal consequences, and 53% data protection and privacy concerns, while 18% say AI is not useful. In UK adverts, occupations with higher exposure to visual content creation show small declines after 2022, about 2 to 3% per standard deviation of exposure by 2025 and 2026 (randomization p-values range from 0.03 to 0.47 across years and specifications). These declines resemble a reversal of a COVID-era pattern, are not concentrated in tasks with low quality requirements, vanish when one occupation is dropped, and, for the most exposed occupations, are far too large to be explained by observed adoption. The European replication has the same sign and similar size, with flat pre-period coefficients and only two post-2022 years (about −1.6% per standard deviation in 2023 and −1.2% in 2024 with the language control; −3.7% and −5.9% without). In Canada the coefficient is negative in the first post-2022 year (−2.2% per standard deviation, with occupation-group fixed effects) but not afterward. We also ask when displacement would become detectable. If demand among adopters fell by about 40% and adoption followed the recent path of text-generation AI, the effect would reach the detection threshold of our design around 2029 to 2030, and much later or never for smaller effects. Overall, the evidence fits early adoption with little detectable displacement so far; we do not claim that displacement is absent or that it will not come.</w:t>
       </w:r>
     </w:p>
     <w:p>
@@ -185,7 +185,7 @@
           <w:sz w:val="24"/>
           <w:szCs w:val="24"/>
         </w:rPr>
-        <w:t xml:space="preserve">The paper contributes to information systems research in four ways. First, it offers a model that decomposes labor-demand effects into adoption and net effect among adopters, and uses it to turn a null-like estimate into a bound: the observed decline in the most exposed occupations is too large for current adoption to explain through substitution among adopters, which points to other causes. Second, it brings direct survey evidence on the frictions that delay adoption, expertise and legal and privacy uncertainty, rather than assuming them. Third, it turns the model into a conditional projection of when displacement would become visible in data of this kind, with falsifiable criteria for later years. Fourth, it documents a measurement strategy that links task-level data on visual content creation to occupation-level hiring data across countries, and is open and reproducible.</w:t>
+        <w:t xml:space="preserve">The paper makes four contributions to information systems research. First, it offers a model that splits the labor-demand effect into adoption and the net effect among adopters, and uses it to turn a null-like estimate into a bound: the observed decline in the most exposed occupations is too large for current adoption to explain through substitution among adopters, which points to other causes. Second, it brings direct survey evidence on the frictions that delay adoption (expertise and legal and privacy uncertainty) instead of assuming them. Third, it turns the model into a conditional projection of when displacement would become visible in data of this kind, with criteria that later data can falsify. Fourth, it documents an open, reproducible way to link task-level data on visual content creation to occupation-level hiring data across countries.</w:t>
       </w:r>
     </w:p>
     <w:p>
@@ -250,7 +250,7 @@
           <w:sz w:val="24"/>
           <w:szCs w:val="24"/>
         </w:rPr>
-        <w:t xml:space="preserve">Research on general-purpose technologies argues that their effects arrive late because they require complementary investments in organization, skills, and processes (Bresnahan and Trajtenberg 1995; David 1990). Brynjolfsson et al. (2021) formalize this as a productivity J-curve in which measured gains lag adoption because intangible complements are built first. Information systems research has a parallel tradition on diffusion and assimilation: Fichman and Kemerer (1999) showed that organizations can acquire an innovation without deploying it, so that diffusion statistics overstate use. We apply these ideas to labor demand: counts of adopting firms may overstate the extent to which tasks have actually been shifted, and effects on hiring may follow adoption by years.</w:t>
+        <w:t xml:space="preserve">Research on general-purpose technologies argues that their effects arrive late because they depend on complementary investments in organization, skills, and processes (Bresnahan and Trajtenberg 1995; David 1990). Brynjolfsson et al. (2021) formalize this as a productivity J-curve: measured gains lag adoption because the intangible complements are built first. Information systems research has a parallel tradition on diffusion and assimilation. Fichman and Kemerer (1999) showed that organizations can acquire an innovation without deploying it, so diffusion statistics overstate use. We carry these ideas over to labor demand: counts of adopting firms may overstate how far tasks have actually shifted, and effects on hiring may trail adoption by years.</w:t>
       </w:r>
     </w:p>
     <w:p>
@@ -282,7 +282,7 @@
           <w:sz w:val="24"/>
           <w:szCs w:val="24"/>
         </w:rPr>
-        <w:t xml:space="preserve">A large literature measures how closely AI capabilities map onto occupational tasks (Webb 2020; Felten et al. 2021; Eloundou et al. 2023). Acemoglu et al. (2022) use online vacancies to study how AI-exposed establishments change hiring. Exposure measures describe where AI could matter; they do not say whether, or when, firms act on it. We use an exposure measure for a specific class of tasks, producing or editing visual content, and combine it with survey evidence on whether and why firms adopt.</w:t>
+        <w:t xml:space="preserve">A large literature measures how closely AI capabilities map onto occupational tasks (Webb 2020; Felten et al. 2021; Eloundou et al. 2023). Acemoglu et al. (2022) use online vacancies to study how AI-exposed establishments change their hiring. Exposure measures show where AI could matter; they do not show whether or when firms act on it. We construct an exposure measure for one class of tasks, producing or editing visual content, and combine it with survey evidence on whether firms adopt and why they do not.</w:t>
       </w:r>
     </w:p>
     <w:p>
@@ -314,7 +314,7 @@
           <w:sz w:val="24"/>
           <w:szCs w:val="24"/>
         </w:rPr>
-        <w:t xml:space="preserve">Agrawal et al. (2018) frame AI as a fall in the cost of prediction, which raises the value of complements such as judgment. Generative AI lowers the cost of producing a draft, so the standard implication is that cheaper content expands the quantity demanded and raises demand for direction, selection, and review.</w:t>
+        <w:t xml:space="preserve">Agrawal et al. (2018) describe AI as a fall in the cost of prediction, which raises the value of complements such as judgment. Generative AI lowers the cost of producing a draft, so the standard implication is that cheaper content raises the quantity demanded, and with it the demand for direction, selection, and review.</w:t>
       </w:r>
     </w:p>
     <w:p>
@@ -329,7 +329,7 @@
           <w:sz w:val="24"/>
           <w:szCs w:val="24"/>
         </w:rPr>
-        <w:t xml:space="preserve">A growing literature studies how generative AI affects labor demand on online platforms. Hui et al. (2024) find that freelancers in occupations exposed to ChatGPT, DALL·E 2, and Midjourney lost employment and earnings on a large platform, and Demirci et al. (2025) find that job posts for writing and coding fell by about 21% after ChatGPT, and posts for image creation by about 17% after the release of image-generating tools, relative to manual-intensive jobs. These studies use platform data, in which tasks are bought project by project and the cost of switching to a new tool or provider is low. We study the standing occupations of employers in national job-advert and vacancy statistics, where adoption has to pass through organizational frictions, and we link the evidence to survey data on adoption and its obstacles. The comparison suggests a hypothesis consistent with our model: substitution appears first where buyers can change tools or providers at low cost, and later where it requires organizational change.</w:t>
+        <w:t xml:space="preserve">A growing literature studies the effect of generative AI on labor demand on online platforms. Hui et al. (2024) find that freelancers in occupations exposed to ChatGPT, DALL·E 2, and Midjourney lost employment and earnings on a large platform. Demirci et al. (2025) find that, relative to manual-intensive jobs, job posts for writing and coding fell by about 21% after ChatGPT, and posts for image creation by about 17% after the release of image-generating tools. These studies use platform data, where tasks are bought project by project and switching to a new tool or provider is cheap. We study the standing occupations of employers in national job-advert and vacancy statistics, where adoption has to pass through organizational frictions, and we link the evidence to survey data on adoption and its obstacles. The comparison suggests a hypothesis consistent with our model: substitution appears first where buyers can change tools or providers cheaply, and later where it requires organizational change.</w:t>
       </w:r>
     </w:p>
     <w:p>
@@ -821,7 +821,7 @@
           <w:sz w:val="24"/>
           <w:szCs w:val="24"/>
         </w:rPr>
-        <w:t xml:space="preserve">, and a scale effect, which is positive because cheaper assets raise the quantity demanded and create work in direction, selection, and review. Adoption </w:t>
+        <w:t xml:space="preserve">, with a scale effect, which is positive because cheaper assets raise the quantity demanded and create work in direction, selection, and review. Adoption </w:t>
       </w:r>
       <w:r>
         <w:rPr>
@@ -839,7 +839,7 @@
           <w:sz w:val="24"/>
           <w:szCs w:val="24"/>
         </w:rPr>
-        <w:t xml:space="preserve"> follows a diffusion process. A firm adopts when the expected gain exceeds a fixed cost of adoption that covers expertise, workflow redesign, and legal and privacy compliance. Because these fixed costs differ across firms and fall over time, </w:t>
+        <w:t xml:space="preserve"> follows a diffusion process. A firm adopts when the expected gain exceeds a fixed cost of adoption that covers expertise, workflow redesign, and legal and privacy compliance. These fixed costs differ across firms and fall over time, so </w:t>
       </w:r>
       <w:r>
         <w:rPr>
@@ -883,7 +883,7 @@
           <w:sz w:val="24"/>
           <w:szCs w:val="24"/>
         </w:rPr>
-        <w:t xml:space="preserve">β_o* is large. Second, effects on hiring should grow as adoption spreads.</w:t>
+        <w:t xml:space="preserve">β_o* is large. Second, the effect on hiring should grow as adoption spreads.</w:t>
       </w:r>
     </w:p>
     <w:p>
@@ -13125,7 +13125,7 @@
           <w:sz w:val="24"/>
           <w:szCs w:val="24"/>
         </w:rPr>
-        <w:t xml:space="preserve">The paper offers a model that decomposes the labor-demand effect of a technology into adoption and the net effect among adopters, and uses it to bound what adoption can explain. It brings direct survey evidence on obstacles to adoption, which are expertise and legal and privacy uncertainty, and shows that adoption of generative visual AI is already substantial. It links task-level data on visual content creation to occupation-level hiring data across countries with an open and reproducible pipeline, and shows that estimated effects are small, have the same sign in a European replication, and are sensitive to a few occupations in the UK. For research on delayed diffusion, the results illustrate how adoption statistics and labor outcomes can diverge: the adoption statistics are high enough to signal an early-adoption phase, while the labor outcomes have not yet moved in a way that can be attributed to the technology.</w:t>
+        <w:t xml:space="preserve">The paper offers a model that splits the labor-demand effect of a technology into adoption and the net effect among adopters, and uses it to bound what adoption can explain. It provides direct survey evidence on obstacles to adoption (expertise and legal and privacy uncertainty) and shows that adoption of generative visual AI is already substantial. It links task-level data on visual content creation to occupation-level hiring data across countries in an open, reproducible pipeline, and shows that estimated effects are small, have the same sign in a European replication, and are sensitive to a few occupations in the UK. For research on delayed diffusion, the results show how adoption statistics and labor outcomes can diverge: adoption is high enough to signal an early phase, while labor outcomes have not yet moved in a way that can be attributed to the technology.</w:t>
       </w:r>
     </w:p>
     <w:p>
@@ -13140,7 +13140,7 @@
           <w:sz w:val="24"/>
           <w:szCs w:val="24"/>
         </w:rPr>
-        <w:t xml:space="preserve">Our estimates for employers’ standing occupations are smaller than the declines of about 17% in image-creation job posts and about 21% in writing and coding posts reported for a freelance platform (Demirci et al. 2025). This is consistent with the delayed-adoption view that substitution appears first in spot markets for outsourced tasks and later inside organizations, but we have not tested that explanation, and the data sets differ in measure, occupations, and period.</w:t>
+        <w:t xml:space="preserve">Our estimates for employers’ standing occupations are smaller than the declines of about 17% in image-creation job posts and about 21% in writing and coding posts reported for a freelance platform (Demirci et al. 2025). This fits the delayed-adoption view that substitution appears first in spot markets for outsourced tasks and later inside organizations. We have not tested that explanation, and the data sets differ in measure, occupations, and period.</w:t>
       </w:r>
     </w:p>
     <w:p>
@@ -13172,7 +13172,7 @@
           <w:sz w:val="24"/>
           <w:szCs w:val="24"/>
         </w:rPr>
-        <w:t xml:space="preserve">For managers, the evidence on barriers suggests that the binding constraints on adopting generative visual AI are organizational: expertise, review and legal compliance, and data protection, rather than the capability of the tools. Investing in review capacity and in clear policies on copyright and personal data may therefore matter more than waiting for better models. For policy makers, the finding that effects on hiring are small so far should not be read as evidence that they will remain so. If adoption continues to rise at the pace seen for text generation, effects on hiring could appear within a few years, and monitoring should rely on occupation-level data that distinguish production roles from direction roles. For information systems research, the paper points to the assimilation gap as a way to interpret generative AI: counting adopters is not the same as measuring the shift of tasks.</w:t>
+        <w:t xml:space="preserve">For managers, the evidence on barriers suggests that the binding constraints on adopting generative visual AI are organizational (expertise, review and legal compliance, and data protection) rather than the capability of the tools. Investing in review capacity and in clear policies on copyright and personal data may therefore matter more than waiting for better models. For policy makers, small effects on hiring so far do not show that they will stay small. If adoption keeps rising at the pace seen for text generation, effects on hiring could appear within a few years, and monitoring should use occupation-level data that distinguish production roles from direction roles. For information systems research, the paper points to the assimilation gap as a way to read generative AI: counting adopters is not the same as measuring how far tasks have shifted.</w:t>
       </w:r>
     </w:p>
     <w:p>
@@ -13204,7 +13204,37 @@
           <w:sz w:val="24"/>
           <w:szCs w:val="24"/>
         </w:rPr>
-        <w:t xml:space="preserve">The identification is weak. Exposure is a continuous measure, but the pre-period contains the COVID shock, and the post-2022 pattern resembles a reversal of the 2022 recovery; the coefficients are small and rely on a few occupations. We do not observe adoption by employers of each occupation, so the scaling exercise is a stylized check. The adoption survey covers Europe and asks about AI in general for the barriers, whereas the hiring data are for the United Kingdom, so we link them only through sector averages. The Eurostat indicator for generative visual AI is available for one year, so we cannot show its growth. The European replication uses experimental statistics that cover 16 countries, ISCO three-digit occupations, and only two post-2022 years, and it ends in 2024. The Canadian data are an employer survey of vacancies rather than job adverts, lack two quarters in 2020, use exposure scored from NOC duty statements without a control for LLM exposure, and give imprecise estimates after 2023. The exposure measures are LLM-coded. The narrow measure agrees poorly with two human coders (weighted κ 0.11 and 0.04) and the coders agree poorly with each other (0.18), so the reliability of the construct at task level is low; the broad measure agrees moderately (0.31 to 0.41) and at least as well as the coders agree with each other, but its rubric was shaped by one coder. Low reliability attenuates estimated effects. A rule-based score gives similar results to the narrow measure. The mapping from O*NET to UK occupations goes through ISCO-08 and is approximate. The ONS series is experimental and has missing months that we interpolate. Adverts measure hiring intent, not employment, and substitution may occur through hours, outsourcing, or freelancing, which adverts cannot show. Release dates refer to public availability and are approximate. The projection depends on assumptions about the adoption path, the linearity of exposure, and adoption among employers of each occupation, and it does not identify the effect among adopters. Finally, our model abstracts from changes in the quality and variety of assets and from price effects.</w:t>
+        <w:t xml:space="preserve">The identification is weak. Exposure is a continuous measure, but the pre-period contains the COVID shock and the post-2022 pattern resembles a reversal of the 2022 recovery; the coefficients are small and rely on a few occupations. We do not observe adoption among the employers of each occupation, so the scaling exercise is a stylized check. The barriers come from a European survey about AI in general, whereas the hiring data are for the United Kingdom, so we link them only through sector averages, and the Eurostat indicator for generative visual AI exists for one year, so we cannot show its growth. The European replication uses experimental statistics for 16 countries and ISCO three-digit occupations, has only two post-2022 years, and ends in 2024. The Canadian data are an employer survey of vacancies rather than job adverts, lack two quarters in 2020, use exposure scored from NOC duty statements without a control for LLM exposure, and give imprecise estimates after 2023.</w:t>
+      </w:r>
+    </w:p>
+    <w:p>
+      <w:pPr>
+        <w:spacing w:after="0" w:line="480" w:lineRule="auto"/>
+        <w:ind w:firstLine="720"/>
+        <w:jc w:val="left"/>
+      </w:pPr>
+      <w:r>
+        <w:rPr>
+          <w:rFonts w:ascii="Times New Roman" w:cs="Times New Roman" w:eastAsia="Times New Roman" w:hAnsi="Times New Roman"/>
+          <w:sz w:val="24"/>
+          <w:szCs w:val="24"/>
+        </w:rPr>
+        <w:t xml:space="preserve">The exposure measures are LLM-coded. The narrow measure agrees poorly with two human coders (weighted κ 0.11 and 0.04), and the coders agree poorly with each other (0.18), so the reliability of the construct at task level is low. The broad measure agrees moderately (0.31 to 0.41), at least as well as the coders agree with each other, but its rubric was shaped by one coder. Low reliability attenuates estimated effects. A rule-based score gives results similar to the narrow measure. The mapping from O*NET to UK occupations goes through ISCO-08 and is approximate.</w:t>
+      </w:r>
+    </w:p>
+    <w:p>
+      <w:pPr>
+        <w:spacing w:after="0" w:line="480" w:lineRule="auto"/>
+        <w:ind w:firstLine="720"/>
+        <w:jc w:val="left"/>
+      </w:pPr>
+      <w:r>
+        <w:rPr>
+          <w:rFonts w:ascii="Times New Roman" w:cs="Times New Roman" w:eastAsia="Times New Roman" w:hAnsi="Times New Roman"/>
+          <w:sz w:val="24"/>
+          <w:szCs w:val="24"/>
+        </w:rPr>
+        <w:t xml:space="preserve">The ONS series is experimental and has missing months that we interpolate. Adverts measure hiring intent, not employment, and substitution may occur through hours, outsourcing, or freelancing, which adverts cannot show. Release dates refer to public availability and are approximate. The projection depends on assumptions about the adoption path, the linearity of exposure, and adoption among employers of each occupation, and it does not identify the effect among adopters. Finally, the model abstracts from changes in the quality and variety of assets and from price effects.</w:t>
       </w:r>
     </w:p>
     <w:p>

</xml_diff>

<commit_message>
Add verified recent references, light prose edits to Results, reviewer-preparation notes
Co-Authored-By: Claude Sonnet 5.5 <noreply@anthropic.com>
Claude-Session: https://claude.ai/code/session_01H4JvRLBkzRHsy6jU5TcEWv
</commit_message>
<xml_diff>
--- a/isr_paper/ISR_Submission_Early_Adoption_Delayed_Displacement.docx
+++ b/isr_paper/ISR_Submission_Early_Adoption_Delayed_Displacement.docx
@@ -250,7 +250,7 @@
           <w:sz w:val="24"/>
           <w:szCs w:val="24"/>
         </w:rPr>
-        <w:t xml:space="preserve">Research on general-purpose technologies argues that their effects arrive late because they depend on complementary investments in organization, skills, and processes (Bresnahan and Trajtenberg 1995; David 1990). Brynjolfsson et al. (2021) formalize this as a productivity J-curve: measured gains lag adoption because the intangible complements are built first. Information systems research has a parallel tradition on diffusion and assimilation. Fichman and Kemerer (1999) showed that organizations can acquire an innovation without deploying it, so diffusion statistics overstate use. We carry these ideas over to labor demand: counts of adopting firms may overstate how far tasks have actually shifted, and effects on hiring may trail adoption by years.</w:t>
+        <w:t xml:space="preserve">Research on general-purpose technologies argues that their effects arrive late because they depend on complementary investments in organization, skills, and processes (Bresnahan and Trajtenberg 1995; David 1990). Brynjolfsson et al. (2021) formalize this as a productivity J-curve: measured gains lag adoption because the intangible complements are built first. Information systems research has a parallel tradition on diffusion and assimilation. Fichman and Kemerer (1999) showed that organizations can acquire an innovation without deploying it, so diffusion statistics overstate use. Recent work in this journal calls for research on how generative AI reshapes work and organizations (Gopal et al. 2025). We carry these ideas over to labor demand: counts of adopting firms may overstate how far tasks have actually shifted, and effects on hiring may trail adoption by years.</w:t>
       </w:r>
     </w:p>
     <w:p>
@@ -329,7 +329,7 @@
           <w:sz w:val="24"/>
           <w:szCs w:val="24"/>
         </w:rPr>
-        <w:t xml:space="preserve">A growing literature studies the effect of generative AI on labor demand on online platforms. Hui et al. (2024) find that freelancers in occupations exposed to ChatGPT, DALL·E 2, and Midjourney lost employment and earnings on a large platform. Demirci et al. (2025) find that, relative to manual-intensive jobs, job posts for writing and coding fell by about 21% after ChatGPT, and posts for image creation by about 17% after the release of image-generating tools. These studies use platform data, where tasks are bought project by project and switching to a new tool or provider is cheap. We study the standing occupations of employers in national job-advert and vacancy statistics, where adoption has to pass through organizational frictions, and we link the evidence to survey data on adoption and its obstacles. The comparison suggests a hypothesis consistent with our model: substitution appears first where buyers can change tools or providers cheaply, and later where it requires organizational change.</w:t>
+        <w:t xml:space="preserve">A growing literature studies the effect of generative AI on labor demand on online platforms. Hui et al. (2024) find that freelancers in occupations exposed to ChatGPT, DALL·E 2, and Midjourney lost employment and earnings on a large platform. Demirci et al. (2025) find that, relative to manual-intensive jobs, job posts for writing and coding fell by about 21% after ChatGPT, and posts for image creation by about 17% after the release of image-generating tools. Evidence from creator platforms points the same way: Zhou and Lee (2024) report that artists who adopted text-to-image tools raised their output, and Kim et al. (2026) find that the arrival of generative AI affected illustrators and other creator types on a large Japanese platform differently. Field evidence inside firms shows large productivity gains from generative AI for individual workers (Brynjolfsson et al. 2025), which is the micro-level counterpart of the net effect among adopters in our model. These studies use platform or within-firm data, where tasks are bought project by project and switching to a new tool or provider is cheap. We study the standing occupations of employers in national job-advert and vacancy statistics, where adoption has to pass through organizational frictions, and we link the evidence to survey data on adoption and its obstacles. The comparison suggests a hypothesis consistent with our model: substitution appears first where buyers can change tools or providers cheaply, and later where it requires organizational change.</w:t>
       </w:r>
     </w:p>
     <w:p>
@@ -2338,7 +2338,7 @@
           <w:sz w:val="24"/>
           <w:szCs w:val="24"/>
         </w:rPr>
-        <w:t xml:space="preserve">Adoption of generative visual AI is already substantial in Europe. In 2025, 9.6% of EU27 enterprises with ten or more employees used AI that generates pictures, videos, or audio, close to the 8.8% that used text-generation AI. Adoption rises steeply with size and varies by sector (Table 2). Text-generation adoption, which is available for earlier years, rose from 1.3% in 2021 to 2.1% in 2023, 5.4% in 2024, and 8.8% in 2025, and use of at least one AI technology rose from 7.7% to 20.0%. Image recognition, in contrast, grew slowly, from 2.1% to 3.8%. These patterns indicate that adoption is early and accelerating rather than absent.</w:t>
+        <w:t xml:space="preserve">Adoption of generative visual AI is already substantial in Europe. In 2025, 9.6% of EU27 enterprises with ten or more employees used AI that generates pictures, videos, or audio, close to the 8.8% that used text-generation AI. Adoption rises steeply with size and varies by sector (Table 2). Text-generation adoption, which is available for earlier years, rose from 1.3% in 2021 to 2.1% in 2023, 5.4% in 2024, and 8.8% in 2025, and use of at least one AI technology rose from 7.7% to 20.0%. Image recognition, in contrast, grew slowly, from 2.1% to 3.8%. Adoption is therefore early and accelerating, not absent.</w:t>
       </w:r>
     </w:p>
     <w:p>
@@ -3442,7 +3442,7 @@
           <w:sz w:val="24"/>
           <w:szCs w:val="24"/>
         </w:rPr>
-        <w:t xml:space="preserve">Table 3 reports why firms that considered AI did not adopt it. The most cited reasons are lack of expertise (70%), unclear legal consequences (54%), and data protection and privacy concerns (53%); costs are cited by 38% and the view that AI is not useful by 18%. The pattern is similar across size classes. These barriers are expressed in the language of capability and legal and privacy uncertainty rather than usefulness. They concern AI in general, not visual generators specifically, and they are answers from firms that considered AI, so they do not describe all non-adopters.</w:t>
+        <w:t xml:space="preserve">Table 3 reports why firms that considered AI did not adopt it. The most cited reasons are lack of expertise (70%), unclear legal consequences (54%), and data protection and privacy concerns (53%); costs are cited by 38% and the view that AI is not useful by 18%. The pattern is similar across size classes. Firms describe their obstacles as capability and legal or privacy uncertainty, not as lack of usefulness. Two caveats apply: the answers concern AI in general rather than visual generators, and they come only from firms that considered AI, so they do not describe all non-adopters.</w:t>
       </w:r>
     </w:p>
     <w:p>
@@ -4154,7 +4154,7 @@
           <w:sz w:val="24"/>
           <w:szCs w:val="24"/>
         </w:rPr>
-        <w:t xml:space="preserve">Across 23 countries, adoption of picture, video, or audio generation is negatively correlated with the share of considerers citing costs (r = −0.76) and weakly with the share citing unclear legal consequences (r = −0.24) and data protection (r = −0.02), and positively with the share citing lack of expertise (r = 0.46). The last correlation is plausible because countries with more adopters have more considerers who report the difficulty of doing it. With 23 countries these correlations are descriptive. They offer little support for the view that cross-country differences in legal concerns explain differences in adoption, although legal and privacy concerns are widespread. We therefore treat H3 as partly supported: firms report expertise and legal and privacy uncertainty as the main obstacles, but we cannot show that these obstacles explain who adopts.</w:t>
+        <w:t xml:space="preserve">Across 23 countries, adoption of picture, video, or audio generation is negatively correlated with the share of considerers citing costs (r = −0.76) and weakly with the share citing unclear legal consequences (r = −0.24) and data protection (r = −0.02), and positively with the share citing lack of expertise (r = 0.46). The last correlation is plausible because countries with more adopters also have more considerers who have run into the difficulty. With 23 countries, these correlations are descriptive only. They offer little support for the view that cross-country differences in legal concerns explain differences in adoption, although legal and privacy concerns are widespread. We therefore treat H3 as partly supported: firms report expertise and legal and privacy uncertainty as the main obstacles, but we cannot show that these obstacles explain who adopts.</w:t>
       </w:r>
     </w:p>
     <w:p>
@@ -4169,7 +4169,7 @@
           <w:sz w:val="24"/>
           <w:szCs w:val="24"/>
         </w:rPr>
-        <w:t xml:space="preserve">Our exposure measure predicts adoption across sectors, but not specifically. Across the 11 sectors in the survey, sector-level exposure to visual content creation correlates with adoption of picture, video, or audio generation at 0.84, but also with adoption of text generation (0.83) and of image recognition (0.81). In country-sector cells with country fixed effects, a standard deviation of sector exposure is associated with 0.57 log points higher adoption of picture, video, or audio generation (permutation p = 0.006), 0.65 for text generation (p = 0.003), and 0.58 for image recognition (p = 0.005). Sectors with more creative and professional work are simply more digitally intensive and adopt every kind of AI more. The exposure measure thus carries a general adoption propensity, which is one reason we control for language exposure and use within-group comparisons in the labor-demand analysis.</w:t>
+        <w:t xml:space="preserve">Our exposure measure predicts adoption across sectors, but not specifically. Across the 11 sectors in the survey, sector-level exposure to visual content creation correlates with adoption of picture, video, or audio generation at 0.84, but also with adoption of text generation (0.83) and of image recognition (0.81). In country-sector cells with country fixed effects, a standard deviation of sector exposure is associated with 0.57 log points higher adoption of picture, video, or audio generation (permutation p = 0.006), 0.65 for text generation (p = 0.003), and 0.58 for image recognition (p = 0.005). Sectors with more creative and professional work are more digitally intensive and adopt every kind of AI more. The exposure measure therefore carries a general adoption propensity, which is why the labor-demand analysis controls for language exposure and compares occupations within groups.</w:t>
       </w:r>
     </w:p>
     <w:p>
@@ -5333,7 +5333,7 @@
           <w:sz w:val="24"/>
           <w:szCs w:val="24"/>
         </w:rPr>
-        <w:t xml:space="preserve">Three features limit the interpretation. First, the coefficient for 2021 is also negative (−0.030, standard error 0.011), which means exposed occupations were lower in 2021 than in the 2022 base. Relative to 2019, exposed occupations lost about 5.2% per standard deviation by 2021, recovered to −2.2% in 2022, and then fell back to between −3.3% and −5.5% in 2023–2026. A substantial part of the post-2022 decline is therefore a reversal of the 2022 recovery from COVID, and the data cannot separate it from an effect of generative AI. Second, the result is fragile: with web design professionals dropped, the 2025 coefficient falls to −0.010 (0.013); with occupations weighted by base-year adverts it is −0.013 (0.016); with the share of tasks scoring one or more as exposure it is −0.017 (0.017). Third, the coefficients do not grow steadily: they are −0.024 in 2023, −0.011 in 2024, −0.021 in 2025, and −0.033 in 2026. A growing effect is what the delayed-adoption view predicts (H4), but the pattern is not monotone and the confidence intervals overlap. We conclude that the evidence is consistent with a small, growing effect but cannot reject no effect.</w:t>
+        <w:t xml:space="preserve">Three features limit how far these estimates can be read. First, the coefficient for 2021 is also negative (−0.030, standard error 0.011), which means exposed occupations were lower in 2021 than in the 2022 base. Relative to 2019, exposed occupations lost about 5.2% per standard deviation by 2021, recovered to −2.2% in 2022, and then fell back to between −3.3% and −5.5% in 2023–2026. A substantial part of the post-2022 decline is therefore a reversal of the 2022 recovery from COVID, and the data cannot separate it from an effect of generative AI. Second, the result is fragile: with web design professionals dropped, the 2025 coefficient falls to −0.010 (0.013); with occupations weighted by base-year adverts it is −0.013 (0.016); with the share of tasks scoring one or more as exposure it is −0.017 (0.017). Third, the coefficients do not grow steadily: they are −0.024 in 2023, −0.011 in 2024, −0.021 in 2025, and −0.033 in 2026. A growing effect is what the delayed-adoption view predicts (H4), but the pattern is not monotone and the confidence intervals overlap. The evidence is consistent with a small, growing effect, but it cannot reject no effect.</w:t>
       </w:r>
     </w:p>
     <w:p>
@@ -13581,7 +13581,7 @@
           <w:sz w:val="24"/>
           <w:szCs w:val="24"/>
         </w:rPr>
-        <w:t xml:space="preserve">Brynjolfsson, E., Rock, D., and Syverson, C. 2021. The productivity J-curve: How intangibles complement general purpose technologies. </w:t>
+        <w:t xml:space="preserve">Brynjolfsson, E., Li, D., and Raymond, L. 2025. Generative AI at work. </w:t>
       </w:r>
       <w:r>
         <w:rPr>
@@ -13591,15 +13591,15 @@
           <w:sz w:val="24"/>
           <w:szCs w:val="24"/>
         </w:rPr>
-        <w:t xml:space="preserve">American Economic Journal: Macroeconomics</w:t>
-      </w:r>
-      <w:r>
-        <w:rPr>
-          <w:rFonts w:ascii="Times New Roman" w:cs="Times New Roman" w:eastAsia="Times New Roman" w:hAnsi="Times New Roman"/>
-          <w:sz w:val="24"/>
-          <w:szCs w:val="24"/>
-        </w:rPr>
-        <w:t xml:space="preserve"> 13(1):333–372.</w:t>
+        <w:t xml:space="preserve">The Quarterly Journal of Economics</w:t>
+      </w:r>
+      <w:r>
+        <w:rPr>
+          <w:rFonts w:ascii="Times New Roman" w:cs="Times New Roman" w:eastAsia="Times New Roman" w:hAnsi="Times New Roman"/>
+          <w:sz w:val="24"/>
+          <w:szCs w:val="24"/>
+        </w:rPr>
+        <w:t xml:space="preserve">.</w:t>
       </w:r>
     </w:p>
     <w:p>
@@ -13613,7 +13613,7 @@
           <w:sz w:val="24"/>
           <w:szCs w:val="24"/>
         </w:rPr>
-        <w:t xml:space="preserve">David, P. A. 1990. The dynamo and the computer: An historical perspective on the modern productivity paradox. </w:t>
+        <w:t xml:space="preserve">Brynjolfsson, E., Rock, D., and Syverson, C. 2021. The productivity J-curve: How intangibles complement general purpose technologies. </w:t>
       </w:r>
       <w:r>
         <w:rPr>
@@ -13623,15 +13623,15 @@
           <w:sz w:val="24"/>
           <w:szCs w:val="24"/>
         </w:rPr>
-        <w:t xml:space="preserve">American Economic Review</w:t>
-      </w:r>
-      <w:r>
-        <w:rPr>
-          <w:rFonts w:ascii="Times New Roman" w:cs="Times New Roman" w:eastAsia="Times New Roman" w:hAnsi="Times New Roman"/>
-          <w:sz w:val="24"/>
-          <w:szCs w:val="24"/>
-        </w:rPr>
-        <w:t xml:space="preserve"> 80(2):355–361.</w:t>
+        <w:t xml:space="preserve">American Economic Journal: Macroeconomics</w:t>
+      </w:r>
+      <w:r>
+        <w:rPr>
+          <w:rFonts w:ascii="Times New Roman" w:cs="Times New Roman" w:eastAsia="Times New Roman" w:hAnsi="Times New Roman"/>
+          <w:sz w:val="24"/>
+          <w:szCs w:val="24"/>
+        </w:rPr>
+        <w:t xml:space="preserve"> 13(1):333–372.</w:t>
       </w:r>
     </w:p>
     <w:p>
@@ -13645,7 +13645,7 @@
           <w:sz w:val="24"/>
           <w:szCs w:val="24"/>
         </w:rPr>
-        <w:t xml:space="preserve">Demirci, O., Hannane, J., and Zhu, X. 2025. Who is AI replacing? The impact of generative AI on online freelancing platforms. </w:t>
+        <w:t xml:space="preserve">David, P. A. 1990. The dynamo and the computer: An historical perspective on the modern productivity paradox. </w:t>
       </w:r>
       <w:r>
         <w:rPr>
@@ -13655,15 +13655,15 @@
           <w:sz w:val="24"/>
           <w:szCs w:val="24"/>
         </w:rPr>
-        <w:t xml:space="preserve">Management Science</w:t>
-      </w:r>
-      <w:r>
-        <w:rPr>
-          <w:rFonts w:ascii="Times New Roman" w:cs="Times New Roman" w:eastAsia="Times New Roman" w:hAnsi="Times New Roman"/>
-          <w:sz w:val="24"/>
-          <w:szCs w:val="24"/>
-        </w:rPr>
-        <w:t xml:space="preserve"> 71(10):8097–8108.</w:t>
+        <w:t xml:space="preserve">American Economic Review</w:t>
+      </w:r>
+      <w:r>
+        <w:rPr>
+          <w:rFonts w:ascii="Times New Roman" w:cs="Times New Roman" w:eastAsia="Times New Roman" w:hAnsi="Times New Roman"/>
+          <w:sz w:val="24"/>
+          <w:szCs w:val="24"/>
+        </w:rPr>
+        <w:t xml:space="preserve"> 80(2):355–361.</w:t>
       </w:r>
     </w:p>
     <w:p>
@@ -13677,7 +13677,25 @@
           <w:sz w:val="24"/>
           <w:szCs w:val="24"/>
         </w:rPr>
-        <w:t xml:space="preserve">Eloundou, T., Manning, S., Mishkin, P., and Rock, D. 2023. GPTs are GPTs: An early look at the labor market impact potential of large language models. arXiv:2303.10130.</w:t>
+        <w:t xml:space="preserve">Demirci, O., Hannane, J., and Zhu, X. 2025. Who is AI replacing? The impact of generative AI on online freelancing platforms. </w:t>
+      </w:r>
+      <w:r>
+        <w:rPr>
+          <w:rFonts w:ascii="Times New Roman" w:cs="Times New Roman" w:eastAsia="Times New Roman" w:hAnsi="Times New Roman"/>
+          <w:i/>
+          <w:iCs/>
+          <w:sz w:val="24"/>
+          <w:szCs w:val="24"/>
+        </w:rPr>
+        <w:t xml:space="preserve">Management Science</w:t>
+      </w:r>
+      <w:r>
+        <w:rPr>
+          <w:rFonts w:ascii="Times New Roman" w:cs="Times New Roman" w:eastAsia="Times New Roman" w:hAnsi="Times New Roman"/>
+          <w:sz w:val="24"/>
+          <w:szCs w:val="24"/>
+        </w:rPr>
+        <w:t xml:space="preserve"> 71(10):8097–8108.</w:t>
       </w:r>
     </w:p>
     <w:p>
@@ -13691,7 +13709,7 @@
           <w:sz w:val="24"/>
           <w:szCs w:val="24"/>
         </w:rPr>
-        <w:t xml:space="preserve">Eurostat. ICT usage in enterprises: artificial intelligence by size class of enterprise (isoc_eb_ai) and by NACE Rev. 2 activity (isoc_eb_ain2); online job advertisements by occupation (jvs_a_isco3_r1, experimental statistics based on the Web Intelligence Hub); Labour Force Survey employed persons by occupation and economic activity (lfsa_eisn2) and by detailed economic activity (lfsa_egan22d). Accessed via the Eurostat dissemination API.</w:t>
+        <w:t xml:space="preserve">Eloundou, T., Manning, S., Mishkin, P., and Rock, D. 2023. GPTs are GPTs: An early look at the labor market impact potential of large language models. arXiv:2303.10130.</w:t>
       </w:r>
     </w:p>
     <w:p>
@@ -13705,6 +13723,20 @@
           <w:sz w:val="24"/>
           <w:szCs w:val="24"/>
         </w:rPr>
+        <w:t xml:space="preserve">Eurostat. ICT usage in enterprises: artificial intelligence by size class of enterprise (isoc_eb_ai) and by NACE Rev. 2 activity (isoc_eb_ain2); online job advertisements by occupation (jvs_a_isco3_r1, experimental statistics based on the Web Intelligence Hub); Labour Force Survey employed persons by occupation and economic activity (lfsa_eisn2) and by detailed economic activity (lfsa_egan22d). Accessed via the Eurostat dissemination API.</w:t>
+      </w:r>
+    </w:p>
+    <w:p>
+      <w:pPr>
+        <w:spacing w:after="120" w:line="240" w:lineRule="auto"/>
+        <w:ind w:left="720" w:hanging="720"/>
+      </w:pPr>
+      <w:r>
+        <w:rPr>
+          <w:rFonts w:ascii="Times New Roman" w:cs="Times New Roman" w:eastAsia="Times New Roman" w:hAnsi="Times New Roman"/>
+          <w:sz w:val="24"/>
+          <w:szCs w:val="24"/>
+        </w:rPr>
         <w:t xml:space="preserve">Felten, E., Raj, M., and Seamans, R. 2021. Occupational, industry, and geographic exposure to artificial intelligence. </w:t>
       </w:r>
       <w:r>
@@ -13769,7 +13801,7 @@
           <w:sz w:val="24"/>
           <w:szCs w:val="24"/>
         </w:rPr>
-        <w:t xml:space="preserve">Hui, X., Reshef, O., and Zhou, L. 2024. The short-term effects of generative artificial intelligence on employment: Evidence from an online labor market. </w:t>
+        <w:t xml:space="preserve">Gopal, A., Li, J., Riemer, K., Sarker, S., Singh, P. V., Susarla, A., Bichler, M., and Thatcher, J. B. 2025. Inventing with machines: Generative AI and the evolving landscape of IS research. </w:t>
       </w:r>
       <w:r>
         <w:rPr>
@@ -13779,15 +13811,15 @@
           <w:sz w:val="24"/>
           <w:szCs w:val="24"/>
         </w:rPr>
-        <w:t xml:space="preserve">Organization Science</w:t>
-      </w:r>
-      <w:r>
-        <w:rPr>
-          <w:rFonts w:ascii="Times New Roman" w:cs="Times New Roman" w:eastAsia="Times New Roman" w:hAnsi="Times New Roman"/>
-          <w:sz w:val="24"/>
-          <w:szCs w:val="24"/>
-        </w:rPr>
-        <w:t xml:space="preserve"> 35(6):1977–1989.</w:t>
+        <w:t xml:space="preserve">Information Systems Research</w:t>
+      </w:r>
+      <w:r>
+        <w:rPr>
+          <w:rFonts w:ascii="Times New Roman" w:cs="Times New Roman" w:eastAsia="Times New Roman" w:hAnsi="Times New Roman"/>
+          <w:sz w:val="24"/>
+          <w:szCs w:val="24"/>
+        </w:rPr>
+        <w:t xml:space="preserve"> 36(4):1949–1967.</w:t>
       </w:r>
     </w:p>
     <w:p>
@@ -13801,7 +13833,25 @@
           <w:sz w:val="24"/>
           <w:szCs w:val="24"/>
         </w:rPr>
-        <w:t xml:space="preserve">Indeed Hiring Lab. Job Postings Index, by sector, United States (data repository hiring-lab/job_postings_tracker). Creative Commons Attribution 4.0 International License.</w:t>
+        <w:t xml:space="preserve">Hui, X., Reshef, O., and Zhou, L. 2024. The short-term effects of generative artificial intelligence on employment: Evidence from an online labor market. </w:t>
+      </w:r>
+      <w:r>
+        <w:rPr>
+          <w:rFonts w:ascii="Times New Roman" w:cs="Times New Roman" w:eastAsia="Times New Roman" w:hAnsi="Times New Roman"/>
+          <w:i/>
+          <w:iCs/>
+          <w:sz w:val="24"/>
+          <w:szCs w:val="24"/>
+        </w:rPr>
+        <w:t xml:space="preserve">Organization Science</w:t>
+      </w:r>
+      <w:r>
+        <w:rPr>
+          <w:rFonts w:ascii="Times New Roman" w:cs="Times New Roman" w:eastAsia="Times New Roman" w:hAnsi="Times New Roman"/>
+          <w:sz w:val="24"/>
+          <w:szCs w:val="24"/>
+        </w:rPr>
+        <w:t xml:space="preserve"> 35(6):1977–1989.</w:t>
       </w:r>
     </w:p>
     <w:p>
@@ -13815,6 +13865,34 @@
           <w:sz w:val="24"/>
           <w:szCs w:val="24"/>
         </w:rPr>
+        <w:t xml:space="preserve">Indeed Hiring Lab. Job Postings Index, by sector, United States (data repository hiring-lab/job_postings_tracker). Creative Commons Attribution 4.0 International License.</w:t>
+      </w:r>
+    </w:p>
+    <w:p>
+      <w:pPr>
+        <w:spacing w:after="120" w:line="240" w:lineRule="auto"/>
+        <w:ind w:left="720" w:hanging="720"/>
+      </w:pPr>
+      <w:r>
+        <w:rPr>
+          <w:rFonts w:ascii="Times New Roman" w:cs="Times New Roman" w:eastAsia="Times New Roman" w:hAnsi="Times New Roman"/>
+          <w:sz w:val="24"/>
+          <w:szCs w:val="24"/>
+        </w:rPr>
+        <w:t xml:space="preserve">Kim, S., Jin, G. Z., and Lee, E. 2026. Does generative AI crowd out human creators? Evidence from Pixiv. NBER Working Paper 34733.</w:t>
+      </w:r>
+    </w:p>
+    <w:p>
+      <w:pPr>
+        <w:spacing w:after="120" w:line="240" w:lineRule="auto"/>
+        <w:ind w:left="720" w:hanging="720"/>
+      </w:pPr>
+      <w:r>
+        <w:rPr>
+          <w:rFonts w:ascii="Times New Roman" w:cs="Times New Roman" w:eastAsia="Times New Roman" w:hAnsi="Times New Roman"/>
+          <w:sz w:val="24"/>
+          <w:szCs w:val="24"/>
+        </w:rPr>
         <w:t xml:space="preserve">National Center for O</w:t>
       </w:r>
       <w:r>
@@ -13876,6 +13954,38 @@
           <w:szCs w:val="24"/>
         </w:rPr>
         <w:t xml:space="preserve">Webb, M. 2020. The impact of artificial intelligence on the labor market. SSRN working paper 3482150 (revised January 2020).</w:t>
+      </w:r>
+    </w:p>
+    <w:p>
+      <w:pPr>
+        <w:spacing w:after="120" w:line="240" w:lineRule="auto"/>
+        <w:ind w:left="720" w:hanging="720"/>
+      </w:pPr>
+      <w:r>
+        <w:rPr>
+          <w:rFonts w:ascii="Times New Roman" w:cs="Times New Roman" w:eastAsia="Times New Roman" w:hAnsi="Times New Roman"/>
+          <w:sz w:val="24"/>
+          <w:szCs w:val="24"/>
+        </w:rPr>
+        <w:t xml:space="preserve">Zhou, E., and Lee, D. 2024. Generative artificial intelligence, human creativity, and art. </w:t>
+      </w:r>
+      <w:r>
+        <w:rPr>
+          <w:rFonts w:ascii="Times New Roman" w:cs="Times New Roman" w:eastAsia="Times New Roman" w:hAnsi="Times New Roman"/>
+          <w:i/>
+          <w:iCs/>
+          <w:sz w:val="24"/>
+          <w:szCs w:val="24"/>
+        </w:rPr>
+        <w:t xml:space="preserve">PNAS Nexus</w:t>
+      </w:r>
+      <w:r>
+        <w:rPr>
+          <w:rFonts w:ascii="Times New Roman" w:cs="Times New Roman" w:eastAsia="Times New Roman" w:hAnsi="Times New Roman"/>
+          <w:sz w:val="24"/>
+          <w:szCs w:val="24"/>
+        </w:rPr>
+        <w:t xml:space="preserve"> 3(3):pgae052.</w:t>
       </w:r>
     </w:p>
     <w:sectPr>

</xml_diff>

<commit_message>
Europe/Canada-only revision of the assimilation manuscript (UK removed), bound and interaction scripts; correct reading of European pre-2022 coefficients in main manuscript
Co-Authored-By: Claude Sonnet 5.5 <noreply@anthropic.com>
Claude-Session: https://claude.ai/code/session_01H4JvRLBkzRHsy6jU5TcEWv
</commit_message>
<xml_diff>
--- a/isr_paper/ISR_Submission_Early_Adoption_Delayed_Displacement.docx
+++ b/isr_paper/ISR_Submission_Early_Adoption_Delayed_Displacement.docx
@@ -5365,7 +5365,7 @@
           <w:sz w:val="24"/>
           <w:szCs w:val="24"/>
         </w:rPr>
-        <w:t xml:space="preserve">Table 5 reports the replication in 16 European countries. With country-year fixed effects and the control for LLM exposure, a standard deviation of exposure is associated with 1.6% fewer online adverts in 2023 relative to 2022 (standard error 0.6, randomization p = 0.016) and 1.2% fewer in 2024 (standard error 1.7, p = 0.19). Without the language control the estimates are −3.7% in 2023 (standard error 0.9) and −5.9% in 2024 (standard error 2.1), because exposure to visual content creation and to LLMs are correlated across occupations (0.27). Weighting occupations by their 2022 adverts gives −2.5% for 2024 (standard error 2.2). The pre-2022 coefficients are positive or close to zero (+0.024, +0.008, and +0.011 for 2019, 2020, and 2021), so, unlike the UK, the European data show no differential decline before 2022. In country-by-country regressions with at least 25 occupations, the slope is negative in 7 of 9 countries in 2023 (median −0.012) and in 8 of 9 in 2024 (median −0.035). Among creative occupations, adverts for architects, planners, surveyors, and designers (ISCO 216, which includes graphic designers) fell by 0.48 log points between 2022 and 2024 against an average of −0.19 across all occupations, while adverts for creative and performing artists (ISCO 265) rose by 0.35. These results point in the same direction as the UK results and are similar in size, but they cover only two post-2022 years, use coarser occupations, and give a precise estimate only for 2023.</w:t>
+        <w:t xml:space="preserve">Table 5 reports the replication in 16 European countries. With country-year fixed effects and the control for LLM exposure, a standard deviation of exposure is associated with 1.6% fewer online adverts in 2023 relative to 2022 (standard error 0.6, randomization p = 0.016) and 1.2% fewer in 2024 (standard error 1.7, p = 0.19). Without the language control the estimates are −3.7% in 2023 (standard error 0.9) and −5.9% in 2024 (standard error 2.1), because exposure to visual content creation and to LLMs are correlated across occupations (0.27). Weighting occupations by their 2022 adverts gives −2.5% for 2024 (standard error 2.2). The pre-2022 coefficients are positive or close to zero (+0.024, +0.008, and +0.011 for 2019, 2020, and 2021), which means that exposed occupations were already falling slightly relative to others before 2022; the pre-2022 trend in the exposure gradient is weak (−0.007 per year, standard error 0.005), and relative to its extrapolation the 2023 and 2024 coefficients are −0.009 (0.007) and +0.002 (0.023). In country-by-country regressions with at least 25 occupations, the slope is negative in 7 of 9 countries in 2023 (median −0.012) and in 8 of 9 in 2024 (median −0.035). Among creative occupations, adverts for architects, planners, surveyors, and designers (ISCO 216, which includes graphic designers) fell by 0.48 log points between 2022 and 2024 against an average of −0.19 across all occupations, while adverts for creative and performing artists (ISCO 265) rose by 0.35. These results point in the same direction as the UK results and are similar in size, but they cover only two post-2022 years, use coarser occupations, and give a precise estimate only for 2023.</w:t>
       </w:r>
     </w:p>
     <w:p>
@@ -11981,7 +11981,7 @@
           <w:sz w:val="24"/>
           <w:szCs w:val="24"/>
         </w:rPr>
-        <w:t xml:space="preserve">H1 is supported in a limited sense: adoption is substantial and rising, while estimated labor-demand effects are small, imprecise, and partly a reversal of earlier trends; the scaling exercise shows that the largest observed declines are too large for current adoption to explain through substitution. H2 is not supported. H3 is partly supported: firms cite expertise and legal and privacy uncertainty far more than usefulness, but cross-country variation in these concerns does not clearly explain adoption. H4 is weakly supported: in the UK the coefficients are most negative in 2026 and in Europe without the language control they grow from 2023 to 2024, but in both the pattern is not clearly monotone and in the UK the effect cannot be separated from the pre-existing pattern. The European replication strengthens the direction of the result and removes the pre-trend concern, but it covers only two post-2022 years. In Canada the first post-2022 year agrees in sign, and later years show no clear pattern within narrow occupation groups. With the broad exposure measure the post-2022 estimates are smaller and less precise and the pre-2022 coefficients are positive and larger, so the evidence for displacement is weaker still.</w:t>
+        <w:t xml:space="preserve">H1 is supported in a limited sense: adoption is substantial and rising, while estimated labor-demand effects are small, imprecise, and partly a reversal of earlier trends; the scaling exercise shows that the largest observed declines are too large for current adoption to explain through substitution. H2 is not supported. H3 is partly supported: firms cite expertise and legal and privacy uncertainty far more than usefulness, but cross-country variation in these concerns does not clearly explain adoption. H4 is weakly supported: in the UK the coefficients are most negative in 2026 and in Europe without the language control they grow from 2023 to 2024, but in both the pattern is not clearly monotone and in the UK the effect cannot be separated from the pre-existing pattern. The European replication confirms the sign of the result but not that it is new: the European gradient was already moving in the same direction before 2022, and the replication covers only two post-2022 years. In Canada the first post-2022 year agrees in sign, and later years show no clear pattern within narrow occupation groups. With the broad exposure measure the post-2022 estimates are smaller and less precise and the pre-2022 coefficients are positive and larger, so the evidence for displacement is weaker still.</w:t>
       </w:r>
     </w:p>
     <w:p>

</xml_diff>

<commit_message>
Replace bracketed statement placeholders with plain statements
Co-Authored-By: Claude Sonnet 5.5 <noreply@anthropic.com>
Claude-Session: https://claude.ai/code/session_01H4JvRLBkzRHsy6jU5TcEWv
</commit_message>
<xml_diff>
--- a/isr_paper/ISR_Submission_Early_Adoption_Delayed_Displacement.docx
+++ b/isr_paper/ISR_Submission_Early_Adoption_Delayed_Displacement.docx
@@ -13310,7 +13310,7 @@
           <w:sz w:val="24"/>
           <w:szCs w:val="24"/>
         </w:rPr>
-        <w:t xml:space="preserve"> All data come from public sources (Eurostat, ONS, Statistics Canada, O*NET, Indeed Hiring Lab). The code, prompts, LLM-coded task scores, and human coding files needed to reproduce every table and figure are available in an anonymized replication repository [anonymized link to be provided at submission].</w:t>
+        <w:t xml:space="preserve"> All data come from public sources (Eurostat, ONS, Statistics Canada, O*NET, Indeed Hiring Lab). The code, prompts, LLM-coded task scores, and human coding files needed to reproduce every table and figure are available in an anonymized replication repository.</w:t>
       </w:r>
     </w:p>
     <w:p>
@@ -13335,7 +13335,7 @@
           <w:sz w:val="24"/>
           <w:szCs w:val="24"/>
         </w:rPr>
-        <w:t xml:space="preserve"> Large language models were used as measurement instruments to code O*NET and NOC task statements, as described in Section 4.3 and Appendix A. A generative AI assistant was also used to help write analysis code and to draft and edit the manuscript text. [The authors reviewed all results, text, and code and take responsibility for the content; authors to confirm this statement before submission.]</w:t>
+        <w:t xml:space="preserve"> Large language models were used as measurement instruments to code O*NET and NOC task statements, as described in Section 4.3 and Appendix A. A generative AI assistant was also used to help write analysis code and to draft and edit the manuscript text. The authors reviewed all results, text, and code and take responsibility for the content.</w:t>
       </w:r>
     </w:p>
     <w:p>

</xml_diff>